<commit_message>
Trying to merge - things got out of sync
</commit_message>
<xml_diff>
--- a/posts/aadab/_response-letter-R3.docx
+++ b/posts/aadab/_response-letter-R3.docx
@@ -22,7 +22,7 @@
         <w:pStyle w:val="FirstParagraph"/>
       </w:pPr>
       <w:r>
-        <w:t xml:space="preserve">I’m grateful to the referee for two rounds of careful comments; the paper is better for both. The revision follows the markup conventions requested by the editorial office: additions are in bold, and substantial deletions are struck through. Some changes were made silently; I’ve described them the end of this letter.</w:t>
+        <w:t xml:space="preserve">I’m grateful to the referee for two rounds of careful comments; the paper is better for both. The revision follows the markup conventions requested by the editorial office: additions are in bold, and substantial deletions are struck through. Some changes were made silently; I’ve described them at the end of this letter.</w:t>
       </w:r>
     </w:p>
     <w:p>
@@ -56,7 +56,7 @@
         <w:t xml:space="preserve"> </w:t>
       </w:r>
       <w:r>
-        <w:t xml:space="preserve">says nothing about the credence one should give to propositions about goodness. The suggestion was that I use a weaker framing: each judgement about Peter harmonizes with a decision theory and can be extended to a general principle. I’ve basically done that. The Aunties’ value functions are now introduced by stipulation. These are artificial characters and it’s fine to say how they make decisions. (This incurs a new debt; which I’ll come back to in point 3.) Each function is described as</w:t>
+        <w:t xml:space="preserve">says nothing about the credence one should give to propositions about goodness. The suggestion was that I use a weaker framing: each judgement about Peter harmonizes with a decision theory and can be extended to a general principle. I’ve basically done that. The Aunties’ value functions are now introduced by stipulation. These are artificial characters and it’s fine to say how they make decisions. (This incurs a new debt, which I’ll come back to in point 3.) Each function is described as</w:t>
       </w:r>
       <w:r>
         <w:t xml:space="preserve"> </w:t>
@@ -72,7 +72,7 @@
         <w:t xml:space="preserve"> </w:t>
       </w:r>
       <w:r>
-        <w:t xml:space="preserve">a decision theory rather than delivered by one; I think it’s still a helpful to the reader to see how the Aunties resemble the famous decision theory, but it’s inspiration not entailment. The paper now says precisely where the inspiration stops: decision theories are theories of choiceworthiness, and the Aunties hold theories of desirability.</w:t>
+        <w:t xml:space="preserve">a decision theory rather than delivered by one; I think it’s still helpful to the reader to see how the Aunties resemble the famous decision theory, but it’s inspiration not entailment. The paper now says precisely where the inspiration stops: decision theories are theories of choiceworthiness, and the Aunties hold theories of desirability.</w:t>
       </w:r>
     </w:p>
     <w:p>
@@ -320,7 +320,7 @@
         <w:t xml:space="preserve"> </w:t>
       </w:r>
       <w:r>
-        <w:t xml:space="preserve">depends. It’s also showing that the Aunties aren’t just making desperate manouevers to save DAB; there is a quite simple example, and any defender of any kind of DAB should have something to say about it, and whatever they say gives them a reason to reject a premise Lewis wanstt to attribute to them.</w:t>
+        <w:t xml:space="preserve">depends. It’s also showing that the Aunties aren’t just making desperate manoeuvres to save DAB; there is a quite simple example, and any defender of any kind of DAB should have something to say about it, and whatever they say gives them a reason to reject a premise Lewis wants to attribute to them.</w:t>
       </w:r>
     </w:p>
     <w:p>
@@ -467,7 +467,7 @@
         <w:t xml:space="preserve">Possible Independence</w:t>
       </w:r>
       <w:r>
-        <w:t xml:space="preserve">. He was right, and the label was wrong — a leftover from an earlier draft in which independence figured as the reductio’s absurd conclusion. The premise is now called</w:t>
+        <w:t xml:space="preserve">. They were right, and the label was wrong — a leftover from an earlier draft in which independence figured as the reductio’s absurd conclusion. The premise is now called</w:t>
       </w:r>
       <w:r>
         <w:t xml:space="preserve"> </w:t>
@@ -583,7 +583,7 @@
         <w:t xml:space="preserve"> </w:t>
       </w:r>
       <w:r>
-        <w:t xml:space="preserve">Additions are in bold and substantial deletions are struck through. The following were done silently, to keep the file readable: typo corrections; the notational overhaul (marking every C-to-Pr change would have flooded the paper with markup); the section retitlings; and, within struck passages, citations, cross-references and formatting are rendered as plain text, and deleted footnotes appear inline as struck</w:t>
+        <w:t xml:space="preserve">Additions are in bold and substantial deletions are struck through. The following were done silently, to keep the file readable: typo corrections; the notational overhaul (marking every C-to-Pr change would have flooded the paper with markup); the section retitlings (sections 3 and 4 are retitled because the old titles reflected the framing that point 1 describes); and, within struck passages, citations and cross-references are rendered as plain text, and deleted footnotes appear inline as struck</w:t>
       </w:r>
       <w:r>
         <w:t xml:space="preserve"> </w:t>
@@ -595,7 +595,7 @@
         <w:t xml:space="preserve"> </w:t>
       </w:r>
       <w:r>
-        <w:t xml:space="preserve">text, since the strikeout markup cannot contain live apparatus.</w:t>
+        <w:t xml:space="preserve">text, since the strikeout markup cannot handle anything beyond simple text.</w:t>
       </w:r>
     </w:p>
     <w:p>
@@ -603,7 +603,7 @@
         <w:pStyle w:val="BodyText"/>
       </w:pPr>
       <w:r>
-        <w:t xml:space="preserve">The new word count is approximately 3970 words including footnotes and abstract, excluding the bibliography.</w:t>
+        <w:t xml:space="preserve">The new word count is 3,969 words including footnotes, excluding the abstract and bibliography (4,048 with the abstract).</w:t>
       </w:r>
     </w:p>
     <w:bookmarkEnd w:id="9"/>

</xml_diff>